<commit_message>
Add targeted tracked MoM review edits with company orange styling
</commit_message>
<xml_diff>
--- a/DQ_ENGINE/review_results/RDS/2026-10-20/RDS_MoM_review_JH_revised.docx
+++ b/DQ_ENGINE/review_results/RDS/2026-10-20/RDS_MoM_review_JH_revised.docx
@@ -51,12 +51,34 @@
     <w:p>
       <w:pPr>
         <w:pStyle w:val="BodyText"/>
-        <w:rPr/>
-      </w:pPr>
+        <w:rPr>
+          <w:ins w:id="1" w:author="Hayes, Julian" w:date="2026-10-29T10:27:00Z" w16du:dateUtc="2026-10-29T10:27:00Z"/>
+        </w:rPr>
+      </w:pPr>
+      <w:r>
+        <w:t>This report summarises the results of month-on-month (MoM) step-change testing of RDS field-level profiling metrics</w:t>
+      </w:r>
+      <w:ins w:id="2" w:author="Hayes, Julian" w:date="2026-10-29T10:24:00Z" w16du:dateUtc="2026-10-29T10:24:00Z">
+        <w:r>
+          <w:t xml:space="preserve"> carried out by MVT</w:t>
+        </w:r>
+      </w:ins>
+      <w:del w:id="133" w:author="MVT proposed edits" w:date="2026-10-29T15:28:23Z">
+        <w:r>
+          <w:delText xml:space="preserve">, using numeric </w:delText>
+        </w:r>
+      </w:del>
       <w:commentRangeStart w:id="3"/>
-      <w:r>
-        <w:t>This report summarises MVT’s month-on-month (MoM) step-change review of RDS field-level profiling metrics. It uses saved results from two executions of the MVT DQ Engine: run 17 for numeric fields and run 18 for categorical, date and identifier fields. These are internal execution numbers, not reporting periods. Observed movements were compared with the data attestation log. Selected observations with relevant documented explanations are summarised at the end, together with any remaining clarification.</w:t>
-      </w:r>
+      <w:del w:id="134" w:author="MVT proposed edits" w:date="2026-10-29T15:28:23Z">
+        <w:r>
+          <w:delText>run 17 and other-field-type run 18</w:delText>
+        </w:r>
+      </w:del>
+      <w:del w:id="135" w:author="MVT proposed edits" w:date="2026-10-29T15:28:23Z">
+        <w:r>
+          <w:delText>(</w:delText>
+        </w:r>
+      </w:del>
       <w:commentRangeEnd w:id="3"/>
       <w:r>
         <w:rPr>
@@ -66,29 +88,107 @@
         </w:rPr>
         <w:commentReference w:id="3"/>
       </w:r>
+      <w:del w:id="136" w:author="MVT proposed edits" w:date="2026-10-29T15:28:23Z">
+        <w:r>
+          <w:delText>MVT DQ Engine)</w:delText>
+        </w:r>
+      </w:del>
+      <w:r>
+        <w:t>. Identified movements were reviewed against the data attestation</w:t>
+      </w:r>
+      <w:ins w:id="4" w:author="Hayes, Julian" w:date="2026-10-29T10:25:00Z" w16du:dateUtc="2026-10-29T10:25:00Z">
+        <w:r>
+          <w:t xml:space="preserve"> log. </w:t>
+        </w:r>
+      </w:ins>
+      <w:ins w:id="5" w:author="Hayes, Julian" w:date="2026-10-29T10:26:00Z" w16du:dateUtc="2026-10-29T10:26:00Z">
+        <w:r>
+          <w:t xml:space="preserve">A number of these movements </w:t>
+        </w:r>
+      </w:ins>
+      <w:ins w:id="6" w:author="Hayes, Julian" w:date="2026-10-29T10:27:00Z" w16du:dateUtc="2026-10-29T10:27:00Z">
+        <w:r>
+          <w:t xml:space="preserve">are </w:t>
+        </w:r>
+        <w:r>
+          <w:t>already explained by existing documentation</w:t>
+        </w:r>
+        <w:r>
+          <w:t xml:space="preserve">, and </w:t>
+        </w:r>
+        <w:r>
+          <w:t>are summarised at the end</w:t>
+        </w:r>
+        <w:r>
+          <w:t xml:space="preserve"> of the document. </w:t>
+        </w:r>
+      </w:ins>
+      <w:ins w:id="137" w:author="MVT proposed edits" w:date="2026-10-29T15:28:23Z">
+        <w:r>
+          <w:t xml:space="preserve"> These are selected observations from our review, not a complete inventory of CDAO-identified issues.</w:t>
+        </w:r>
+      </w:ins>
     </w:p>
     <w:p>
       <w:pPr>
         <w:pStyle w:val="BodyText"/>
       </w:pPr>
-      <w:r>
-        <w:t xml:space="preserve">However, </w:t>
-      </w:r>
-      <w:r>
-        <w:t>f</w:t>
-      </w:r>
+      <w:ins w:id="7" w:author="Hayes, Julian" w:date="2026-10-29T10:27:00Z" w16du:dateUtc="2026-10-29T10:27:00Z">
+        <w:r>
+          <w:t xml:space="preserve">However, </w:t>
+        </w:r>
+      </w:ins>
+      <w:del w:id="8" w:author="Hayes, Julian" w:date="2026-10-29T10:24:00Z" w16du:dateUtc="2026-10-29T10:24:00Z">
+        <w:r>
+          <w:delText>.</w:delText>
+        </w:r>
+      </w:del>
+      <w:del w:id="9" w:author="Hayes, Julian" w:date="2026-10-29T10:27:00Z" w16du:dateUtc="2026-10-29T10:27:00Z">
+        <w:r>
+          <w:delText>F</w:delText>
+        </w:r>
+      </w:del>
+      <w:ins w:id="10" w:author="Hayes, Julian" w:date="2026-10-29T10:27:00Z" w16du:dateUtc="2026-10-29T10:27:00Z">
+        <w:r>
+          <w:t>f</w:t>
+        </w:r>
+      </w:ins>
       <w:r>
         <w:t xml:space="preserve">ive findings </w:t>
       </w:r>
-      <w:r>
-        <w:t xml:space="preserve">were identified which </w:t>
-      </w:r>
+      <w:ins w:id="11" w:author="Hayes, Julian" w:date="2026-10-29T10:25:00Z" w16du:dateUtc="2026-10-29T10:25:00Z">
+        <w:r>
+          <w:t xml:space="preserve">were identified which </w:t>
+        </w:r>
+      </w:ins>
       <w:r>
         <w:t>require CDAO clarification</w:t>
       </w:r>
-      <w:r>
-        <w:t>. They are detailed below.</w:t>
-      </w:r>
+      <w:ins w:id="12" w:author="Hayes, Julian" w:date="2026-10-29T10:28:00Z" w16du:dateUtc="2026-10-29T10:28:00Z">
+        <w:r>
+          <w:t>. They are detailed below.</w:t>
+        </w:r>
+      </w:ins>
+      <w:del w:id="13" w:author="Hayes, Julian" w:date="2026-10-29T10:27:00Z" w16du:dateUtc="2026-10-29T10:27:00Z">
+        <w:r>
+          <w:delText xml:space="preserve">; </w:delText>
+        </w:r>
+      </w:del>
+      <w:del w:id="14" w:author="Hayes, Julian" w:date="2026-10-29T10:28:00Z" w16du:dateUtc="2026-10-29T10:28:00Z">
+        <w:r>
+          <w:delText xml:space="preserve">movements </w:delText>
+        </w:r>
+      </w:del>
+      <w:del w:id="15" w:author="Hayes, Julian" w:date="2026-10-29T10:27:00Z" w16du:dateUtc="2026-10-29T10:27:00Z">
+        <w:r>
+          <w:delText>explained by existing documentation are summarised at the end</w:delText>
+        </w:r>
+      </w:del>
+      <w:del w:id="16" w:author="Hayes, Julian" w:date="2026-10-29T10:28:00Z" w16du:dateUtc="2026-10-29T10:28:00Z">
+        <w:r>
+          <w:delText>.</w:delText>
+        </w:r>
+      </w:del>
     </w:p>
     <w:p>
       <w:pPr>
@@ -106,9 +206,19 @@
       <w:pPr>
         <w:pStyle w:val="FirstParagraph"/>
       </w:pPr>
+      <w:r>
+        <w:rPr>
+          <w:b/>
+          <w:bCs/>
+        </w:rPr>
+        <w:t>Observation:</w:t>
+      </w:r>
+      <w:r>
+        <w:t xml:space="preserve"> In November 2018</w:t>
+      </w:r>
       <w:commentRangeStart w:id="18"/>
       <w:r>
-        <w:t>Observation: In November 2018, 56 fields each increased from zero missing records to 20,808 missing records, approximately 16.06% of the population. A similar increase was observed in RATE_TYPE. CDAO had already documented portfolio-related missingness for some example fields; the additional MVT observation is the common timing and missing-count increase across the wider field group. The examples below show that elevated missingness persisted into December:</w:t>
+        <w:t>, 56 fields each increased from zero missing records to 20,808 missing records</w:t>
       </w:r>
       <w:commentRangeEnd w:id="18"/>
       <w:r>
@@ -118,6 +228,18 @@
           <w:szCs w:val="24"/>
         </w:rPr>
         <w:commentReference w:id="18"/>
+      </w:r>
+      <w:r>
+        <w:t xml:space="preserve">, approximately 16.06% of the population. A similar increase was observed in </w:t>
+      </w:r>
+      <w:r>
+        <w:rPr>
+          <w:rStyle w:val="VerbatimChar"/>
+        </w:rPr>
+        <w:t>RATE_TYPE</w:t>
+      </w:r>
+      <w:r>
+        <w:t>. The examples below show that elevated missingness persisted into December:</w:t>
       </w:r>
     </w:p>
     <w:tbl>
@@ -169,6 +291,7 @@
               <w:rPr>
                 <w:b/>
                 <w:sz w:val="18"/>
+                <w:color w:val="1D252C"/>
               </w:rPr>
               <w:t>Field</w:t>
             </w:r>
@@ -196,6 +319,7 @@
               <w:rPr>
                 <w:b/>
                 <w:sz w:val="18"/>
+                <w:color w:val="1D252C"/>
               </w:rPr>
               <w:t>Missing: Oct 2018</w:t>
             </w:r>
@@ -223,6 +347,7 @@
               <w:rPr>
                 <w:b/>
                 <w:sz w:val="18"/>
+                <w:color w:val="1D252C"/>
               </w:rPr>
               <w:t>Missing: Nov 2018</w:t>
             </w:r>
@@ -250,6 +375,7 @@
               <w:rPr>
                 <w:b/>
                 <w:sz w:val="18"/>
+                <w:color w:val="1D252C"/>
               </w:rPr>
               <w:t>Missing: Dec 2018</w:t>
             </w:r>
@@ -618,7 +744,157 @@
       </w:pPr>
       <w:commentRangeStart w:id="19"/>
       <w:r>
-        <w:t>CDAO’s comments already provide a plausible portfolio explanation for late-2018/early-2019 missingness in CHQ_ANNUAL_CREDIT_TURNOVER (W503) and PROBE-sourced NULLs in CHQ_LMT_UTIL_AVG_BAL_6M between Glas/Glenbeigh cutover and migration (W157). The remaining clarification is whether this explanation covers the observed November 2018 population and wider 56-field group, and the simultaneous shift between special and missing values in CHQ_LMT_UTIL_AVG_BAL_6M. The RATE_TYPE comment (W147) addresses pre-2012 tracker-flag remediation and does not explain its November 2018 change.</w:t>
+        <w:t xml:space="preserve">CDAO’s comments link late-2018/early-2019 missingness in </w:t>
+      </w:r>
+      <w:r>
+        <w:rPr>
+          <w:rStyle w:val="VerbatimChar"/>
+        </w:rPr>
+        <w:t xml:space="preserve">CHQ_ANNUAL_CREDIT_TURNOVER</w:t>
+      </w:r>
+      <w:r>
+        <w:t xml:space="preserve"> to Glenbeigh (W503), and NULLs in </w:t>
+      </w:r>
+      <w:r>
+        <w:rPr>
+          <w:rStyle w:val="VerbatimChar"/>
+        </w:rPr>
+        <w:t xml:space="preserve">CHQ_LMT_UTIL_AVG_BAL_6M</w:t>
+      </w:r>
+      <w:r>
+        <w:t xml:space="preserve"> to the Glas/Glenbeigh portfolios between cutover and migration (W157). Both fields are identified as PROBE-sourced. </w:t>
+      </w:r>
+      <w:del w:id="138" w:author="MVT proposed edits" w:date="2026-10-29T15:28:23Z">
+        <w:r>
+          <w:delText xml:space="preserve">The</w:delText>
+        </w:r>
+      </w:del>
+      <w:ins w:id="139" w:author="MVT proposed edits" w:date="2026-10-29T15:28:23Z">
+        <w:r>
+          <w:t xml:space="preserve">This</w:t>
+        </w:r>
+      </w:ins>
+      <w:r>
+        <w:t xml:space="preserve"> </w:t>
+      </w:r>
+      <w:del w:id="140" w:author="MVT proposed edits" w:date="2026-10-29T15:28:23Z">
+        <w:r>
+          <w:delText xml:space="preserve">comments</w:delText>
+        </w:r>
+      </w:del>
+      <w:ins w:id="141" w:author="MVT proposed edits" w:date="2026-10-29T15:28:23Z">
+        <w:r>
+          <w:t xml:space="preserve">provides</w:t>
+        </w:r>
+      </w:ins>
+      <w:r>
+        <w:t xml:space="preserve"> </w:t>
+      </w:r>
+      <w:del w:id="142" w:author="MVT proposed edits" w:date="2026-10-29T15:28:23Z">
+        <w:r>
+          <w:delText xml:space="preserve">do</w:delText>
+        </w:r>
+      </w:del>
+      <w:ins w:id="143" w:author="MVT proposed edits" w:date="2026-10-29T15:28:23Z">
+        <w:r>
+          <w:t xml:space="preserve">relevant</w:t>
+        </w:r>
+      </w:ins>
+      <w:r>
+        <w:t xml:space="preserve"> </w:t>
+      </w:r>
+      <w:del w:id="144" w:author="MVT proposed edits" w:date="2026-10-29T15:28:23Z">
+        <w:r>
+          <w:delText xml:space="preserve">not</w:delText>
+        </w:r>
+      </w:del>
+      <w:ins w:id="145" w:author="MVT proposed edits" w:date="2026-10-29T15:28:23Z">
+        <w:r>
+          <w:t xml:space="preserve">context,</w:t>
+        </w:r>
+      </w:ins>
+      <w:r>
+        <w:t xml:space="preserve"> </w:t>
+      </w:r>
+      <w:del w:id="146" w:author="MVT proposed edits" w:date="2026-10-29T15:28:23Z">
+        <w:r>
+          <w:delText xml:space="preserve">specify the exact event dates or reconcile</w:delText>
+        </w:r>
+      </w:del>
+      <w:ins w:id="147" w:author="MVT proposed edits" w:date="2026-10-29T15:28:23Z">
+        <w:r>
+          <w:t xml:space="preserve">but</w:t>
+        </w:r>
+      </w:ins>
+      <w:r>
+        <w:t xml:space="preserve"> the affected </w:t>
+      </w:r>
+      <w:del w:id="148" w:author="MVT proposed edits" w:date="2026-10-29T15:28:23Z">
+        <w:r>
+          <w:delText xml:space="preserve">population</w:delText>
+        </w:r>
+      </w:del>
+      <w:ins w:id="149" w:author="MVT proposed edits" w:date="2026-10-29T15:28:23Z">
+        <w:r>
+          <w:t xml:space="preserve">periods</w:t>
+        </w:r>
+      </w:ins>
+      <w:r>
+        <w:t xml:space="preserve"> </w:t>
+      </w:r>
+      <w:del w:id="150" w:author="MVT proposed edits" w:date="2026-10-29T15:28:23Z">
+        <w:r>
+          <w:delText xml:space="preserve">to</w:delText>
+        </w:r>
+      </w:del>
+      <w:ins w:id="151" w:author="MVT proposed edits" w:date="2026-10-29T15:28:23Z">
+        <w:r>
+          <w:t xml:space="preserve">are not clear for all fields. In particular,</w:t>
+        </w:r>
+      </w:ins>
+      <w:r>
+        <w:t xml:space="preserve"> the</w:t>
+      </w:r>
+      <w:ins w:id="152" w:author="MVT proposed edits" w:date="2026-10-29T15:28:23Z">
+        <w:r>
+          <w:t xml:space="preserve"> attestation does not clearly map the separate changes observed in</w:t>
+        </w:r>
+      </w:ins>
+      <w:r>
+        <w:t xml:space="preserve"> November 2018</w:t>
+      </w:r>
+      <w:ins w:id="153" w:author="MVT proposed edits" w:date="2026-10-29T15:28:23Z">
+        <w:r>
+          <w:t xml:space="preserve">,</w:t>
+        </w:r>
+      </w:ins>
+      <w:r>
+        <w:t xml:space="preserve"> </w:t>
+      </w:r>
+      <w:del w:id="154" w:author="MVT proposed edits" w:date="2026-10-29T15:28:23Z">
+        <w:r>
+          <w:delText xml:space="preserve">counts</w:delText>
+        </w:r>
+      </w:del>
+      <w:ins w:id="155" w:author="MVT proposed edits" w:date="2026-10-29T15:28:23Z">
+        <w:r>
+          <w:t xml:space="preserve">February 2019 and May 2019 to each affected field and population, or establish whether the impact was continuous between those months</w:t>
+        </w:r>
+      </w:ins>
+      <w:r>
+        <w:t xml:space="preserve">. </w:t>
+      </w:r>
+      <w:r>
+        <w:t xml:space="preserve">The comment for </w:t>
+      </w:r>
+      <w:r>
+        <w:rPr>
+          <w:rStyle w:val="VerbatimChar"/>
+        </w:rPr>
+        <w:t xml:space="preserve">RATE_TYPE</w:t>
+      </w:r>
+      <w:r>
+        <w:t xml:space="preserve"> (W147) addresses pre-2012 tracker-flag remediation rather than the November 2018 change.</w:t>
       </w:r>
       <w:commentRangeEnd w:id="19"/>
       <w:r>
@@ -651,7 +927,106 @@
         </w:numPr>
       </w:pPr>
       <w:r>
-        <w:t>Confirm whether the documented portfolio explanation applies to the November 2018 population and wider field group. Explain any residual changes, the missing/special coding shift in CHQ_LMT_UTIL_AVG_BAL_6M, and the separate RATE_TYPE movement.</w:t>
+        <w:t xml:space="preserve">Confirm </w:t>
+      </w:r>
+      <w:del w:id="156" w:author="MVT proposed edits" w:date="2026-10-29T15:28:23Z">
+        <w:r>
+          <w:delText xml:space="preserve">the</w:delText>
+        </w:r>
+      </w:del>
+      <w:ins w:id="157" w:author="MVT proposed edits" w:date="2026-10-29T15:28:23Z">
+        <w:r>
+          <w:t xml:space="preserve">which</w:t>
+        </w:r>
+      </w:ins>
+      <w:r>
+        <w:t xml:space="preserve"> </w:t>
+      </w:r>
+      <w:del w:id="158" w:author="MVT proposed edits" w:date="2026-10-29T15:28:23Z">
+        <w:r>
+          <w:delText xml:space="preserve">cause</w:delText>
+        </w:r>
+      </w:del>
+      <w:ins w:id="159" w:author="MVT proposed edits" w:date="2026-10-29T15:28:23Z">
+        <w:r>
+          <w:t xml:space="preserve">affected fields</w:t>
+        </w:r>
+      </w:ins>
+      <w:r>
+        <w:t xml:space="preserve"> and </w:t>
+      </w:r>
+      <w:del w:id="160" w:author="MVT proposed edits" w:date="2026-10-29T15:28:23Z">
+        <w:r>
+          <w:delText xml:space="preserve">affected population, including whether the examples</w:delText>
+        </w:r>
+      </w:del>
+      <w:ins w:id="161" w:author="MVT proposed edits" w:date="2026-10-29T15:28:23Z">
+        <w:r>
+          <w:t xml:space="preserve">populations</w:t>
+        </w:r>
+      </w:ins>
+      <w:r>
+        <w:t xml:space="preserve"> relate to </w:t>
+      </w:r>
+      <w:ins w:id="162" w:author="MVT proposed edits" w:date="2026-10-29T15:28:23Z">
+        <w:r>
+          <w:t xml:space="preserve">each </w:t>
+        </w:r>
+      </w:ins>
+      <w:r>
+        <w:t xml:space="preserve">portfolio </w:t>
+      </w:r>
+      <w:del w:id="163" w:author="MVT proposed edits" w:date="2026-10-29T15:28:23Z">
+        <w:r>
+          <w:delText xml:space="preserve">sales</w:delText>
+        </w:r>
+      </w:del>
+      <w:ins w:id="164" w:author="MVT proposed edits" w:date="2026-10-29T15:28:23Z">
+        <w:r>
+          <w:t xml:space="preserve">event, and whether missingness persisted between cutover and migration</w:t>
+        </w:r>
+      </w:ins>
+      <w:r>
+        <w:t xml:space="preserve"> or </w:t>
+      </w:r>
+      <w:del w:id="165" w:author="MVT proposed edits" w:date="2026-10-29T15:28:23Z">
+        <w:r>
+          <w:delText xml:space="preserve">changes</w:delText>
+        </w:r>
+      </w:del>
+      <w:ins w:id="166" w:author="MVT proposed edits" w:date="2026-10-29T15:28:23Z">
+        <w:r>
+          <w:t xml:space="preserve">was limited to specific months. Clarify the November 2018 missing/special-value coding change</w:t>
+        </w:r>
+      </w:ins>
+      <w:r>
+        <w:t xml:space="preserve"> in </w:t>
+      </w:r>
+      <w:del w:id="167" w:author="MVT proposed edits" w:date="2026-10-29T15:28:23Z">
+        <w:r>
+          <w:delText xml:space="preserve">data</w:delText>
+        </w:r>
+      </w:del>
+      <w:ins w:id="168" w:author="MVT proposed edits" w:date="2026-10-29T15:28:23Z">
+        <w:r>
+          <w:t xml:space="preserve">CHQ_LMT_UTIL_AVG_BAL_6M</w:t>
+        </w:r>
+      </w:ins>
+      <w:r>
+        <w:t xml:space="preserve"> </w:t>
+      </w:r>
+      <w:del w:id="169" w:author="MVT proposed edits" w:date="2026-10-29T15:28:23Z">
+        <w:r>
+          <w:delText xml:space="preserve">processing</w:delText>
+        </w:r>
+      </w:del>
+      <w:ins w:id="170" w:author="MVT proposed edits" w:date="2026-10-29T15:28:23Z">
+        <w:r>
+          <w:t xml:space="preserve">and the separate RATE_TYPE movement</w:t>
+        </w:r>
+      </w:ins>
+      <w:r>
+        <w:t xml:space="preserve">.</w:t>
       </w:r>
     </w:p>
     <w:p>
@@ -663,7 +1038,49 @@
         </w:numPr>
       </w:pPr>
       <w:r>
-        <w:t>Record the applicable sale, cutover and migration dates, affected fields/population and period of missingness explicitly in the attestation, with supporting reconciliation where available.</w:t>
+        <w:t xml:space="preserve">Update the attestation with the relevant portfolio sale, cutover and migration dates, </w:t>
+      </w:r>
+      <w:ins w:id="171" w:author="MVT proposed edits" w:date="2026-10-29T15:28:23Z">
+        <w:r>
+          <w:t xml:space="preserve">the </w:t>
+        </w:r>
+      </w:ins>
+      <w:r>
+        <w:t xml:space="preserve">affected </w:t>
+      </w:r>
+      <w:del w:id="172" w:author="MVT proposed edits" w:date="2026-10-29T15:28:23Z">
+        <w:r>
+          <w:delText xml:space="preserve">sources/</w:delText>
+        </w:r>
+      </w:del>
+      <w:r>
+        <w:t xml:space="preserve">fields and </w:t>
+      </w:r>
+      <w:del w:id="173" w:author="MVT proposed edits" w:date="2026-10-29T15:28:23Z">
+        <w:r>
+          <w:delText xml:space="preserve">period</w:delText>
+        </w:r>
+      </w:del>
+      <w:ins w:id="174" w:author="MVT proposed edits" w:date="2026-10-29T15:28:23Z">
+        <w:r>
+          <w:t xml:space="preserve">the start/end periods</w:t>
+        </w:r>
+      </w:ins>
+      <w:r>
+        <w:t xml:space="preserve"> of </w:t>
+      </w:r>
+      <w:del w:id="175" w:author="MVT proposed edits" w:date="2026-10-29T15:28:23Z">
+        <w:r>
+          <w:delText xml:space="preserve">missingness</w:delText>
+        </w:r>
+      </w:del>
+      <w:ins w:id="176" w:author="MVT proposed edits" w:date="2026-10-29T15:28:23Z">
+        <w:r>
+          <w:t xml:space="preserve">impact for each field</w:t>
+        </w:r>
+      </w:ins>
+      <w:r>
+        <w:t xml:space="preserve">.</w:t>
       </w:r>
     </w:p>
     <w:p>
@@ -865,6 +1282,7 @@
               <w:rPr>
                 <w:b/>
                 <w:sz w:val="18"/>
+                <w:color w:val="1D252C"/>
               </w:rPr>
               <w:t>Fact date</w:t>
             </w:r>
@@ -892,6 +1310,7 @@
               <w:rPr>
                 <w:b/>
                 <w:sz w:val="18"/>
+                <w:color w:val="1D252C"/>
               </w:rPr>
               <w:t>Records with NULL PCKG_ID</w:t>
             </w:r>
@@ -919,6 +1338,7 @@
               <w:rPr>
                 <w:b/>
                 <w:sz w:val="18"/>
+                <w:color w:val="1D252C"/>
               </w:rPr>
               <w:t>Bill amount repeated on every record</w:t>
             </w:r>
@@ -1120,8 +1540,32 @@
           <w:numId w:val="4"/>
         </w:numPr>
       </w:pPr>
-      <w:r>
-        <w:t>Investigate why records with NULL PCKG_ID increased sharply in February and May 2019, identifying the affected populations and source or processing changes.</w:t>
+      <w:ins w:id="23" w:author="Hayes, Julian" w:date="2026-10-29T09:36:00Z" w16du:dateUtc="2026-10-29T09:36:00Z">
+        <w:r>
+          <w:t xml:space="preserve">Investigate </w:t>
+        </w:r>
+      </w:ins>
+      <w:del w:id="24" w:author="Hayes, Julian" w:date="2026-10-29T09:36:00Z" w16du:dateUtc="2026-10-29T09:36:00Z">
+        <w:r>
+          <w:delText>W</w:delText>
+        </w:r>
+      </w:del>
+      <w:ins w:id="25" w:author="Hayes, Julian" w:date="2026-10-29T09:36:00Z" w16du:dateUtc="2026-10-29T09:36:00Z">
+        <w:r>
+          <w:t>w</w:t>
+        </w:r>
+      </w:ins>
+      <w:r>
+        <w:t xml:space="preserve">hy did the number of records with NULL </w:t>
+      </w:r>
+      <w:r>
+        <w:rPr>
+          <w:rStyle w:val="VerbatimChar"/>
+        </w:rPr>
+        <w:t>PCKG_ID</w:t>
+      </w:r>
+      <w:r>
+        <w:t xml:space="preserve"> increase sharply in February and May 2019, and which source/process changes and populations were affected?</w:t>
       </w:r>
     </w:p>
     <w:p>
@@ -1131,12 +1575,28 @@
           <w:ilvl w:val="0"/>
           <w:numId w:val="4"/>
         </w:numPr>
-        <w:rPr/>
+        <w:rPr>
+          <w:ins w:id="26" w:author="Hayes, Julian" w:date="2026-10-29T09:37:00Z" w16du:dateUtc="2026-10-29T09:37:00Z"/>
+        </w:rPr>
       </w:pPr>
       <w:commentRangeStart w:id="27"/>
       <w:r>
-        <w:t>Confirm how PD_SEG_BILL_AMT_PCKG should handle NULL package IDs to avoid combining unrelated agreements. Make any required corrections to the calculation and affected data, and update the attestation with the cause, affected periods and agreed treatment.</w:t>
-      </w:r>
+        <w:t xml:space="preserve">How should </w:t>
+      </w:r>
+      <w:r>
+        <w:rPr>
+          <w:rStyle w:val="VerbatimChar"/>
+        </w:rPr>
+        <w:t xml:space="preserve">PD_SEG_BILL_AMT_PCKG</w:t>
+      </w:r>
+      <w:r>
+        <w:t xml:space="preserve"> handle NULL package IDs to avoid combining unrelated agreements? Please confirm and make any required corrections to the calculation and affected data, and update the attestation with the cause, affected periods and agreed treatment.</w:t>
+      </w:r>
+      <w:ins w:id="177" w:author="MVT proposed edits" w:date="2026-10-29T15:28:23Z">
+        <w:r>
+          <w:t xml:space="preserve"> Assess whether other package-derived fields that aggregate or join on PCKG_ID are also affected by NULL keys, and document the affected scope and agreed treatment.</w:t>
+        </w:r>
+      </w:ins>
       <w:commentRangeEnd w:id="27"/>
       <w:r>
         <w:rPr>
@@ -1150,20 +1610,16 @@
     <w:p>
       <w:pPr>
         <w:pStyle w:val="Compact"/>
-        <w:numPr>
-          <w:ilvl w:val="0"/>
-          <w:numId w:val="4"/>
-        </w:numPr>
-        <w:rPr/>
-      </w:pPr>
-      <w:r>
-        <w:t>Assess whether other package-derived fields aggregate or join on PCKG_ID and could be affected by NULL keys. Confirm their NULL-key treatment, quantify any affected fields and periods, and document any required remediation. Wider impact has not yet been established.</w:t>
-      </w:r>
-    </w:p>
-    <w:p>
-      <w:pPr>
-        <w:pStyle w:val="Compact"/>
         <w:ind w:left="360"/>
+        <w:pPrChange w:id="28" w:author="Hayes, Julian" w:date="2026-10-29T09:37:00Z" w16du:dateUtc="2026-10-29T09:37:00Z">
+          <w:pPr>
+            <w:pStyle w:val="Compact"/>
+            <w:numPr>
+              <w:numId w:val="4"/>
+            </w:numPr>
+            <w:ind w:left="720" w:hanging="360"/>
+          </w:pPr>
+        </w:pPrChange>
       </w:pPr>
     </w:p>
     <w:p>
@@ -1243,6 +1699,7 @@
               <w:rPr>
                 <w:b/>
                 <w:sz w:val="18"/>
+                <w:color w:val="1D252C"/>
               </w:rPr>
               <w:t>Field / metric</w:t>
             </w:r>
@@ -1270,6 +1727,7 @@
               <w:rPr>
                 <w:b/>
                 <w:sz w:val="18"/>
+                <w:color w:val="1D252C"/>
               </w:rPr>
               <w:t>May 2024</w:t>
             </w:r>
@@ -1297,6 +1755,7 @@
               <w:rPr>
                 <w:b/>
                 <w:sz w:val="18"/>
+                <w:color w:val="1D252C"/>
               </w:rPr>
               <w:t>June 2024</w:t>
             </w:r>
@@ -1324,6 +1783,7 @@
               <w:rPr>
                 <w:b/>
                 <w:sz w:val="18"/>
+                <w:color w:val="1D252C"/>
               </w:rPr>
               <w:t>July 2024</w:t>
             </w:r>
@@ -1870,9 +2330,38 @@
       </w:pPr>
       <w:bookmarkStart w:id="31" w:name="documented-findings"/>
       <w:commentRangeStart w:id="32"/>
-      <w:r>
-        <w:t>Selected observations with documented explanations</w:t>
-      </w:r>
+      <w:del w:id="178" w:author="MVT proposed edits" w:date="2026-10-29T15:28:23Z">
+        <w:r>
+          <w:rPr>
+            <w:rFonts w:ascii="Calibri" w:eastAsia="Calibri" w:hAnsi="Calibri" w:cs="Calibri"/>
+          </w:rPr>
+          <w:delText xml:space="preserve">Documented</w:delText>
+        </w:r>
+      </w:del>
+      <w:ins w:id="179" w:author="MVT proposed edits" w:date="2026-10-29T15:28:23Z">
+        <w:r>
+          <w:t xml:space="preserve">Selected</w:t>
+        </w:r>
+      </w:ins>
+      <w:r>
+        <w:rPr>
+          <w:rFonts w:ascii="Calibri" w:eastAsia="Calibri" w:hAnsi="Calibri" w:cs="Calibri"/>
+        </w:rPr>
+        <w:t xml:space="preserve"> </w:t>
+      </w:r>
+      <w:del w:id="180" w:author="MVT proposed edits" w:date="2026-10-29T15:28:23Z">
+        <w:r>
+          <w:rPr>
+            <w:rFonts w:ascii="Calibri" w:eastAsia="Calibri" w:hAnsi="Calibri" w:cs="Calibri"/>
+          </w:rPr>
+          <w:delText xml:space="preserve">findings</w:delText>
+        </w:r>
+      </w:del>
+      <w:ins w:id="181" w:author="MVT proposed edits" w:date="2026-10-29T15:28:23Z">
+        <w:r>
+          <w:t xml:space="preserve">observations with documented explanations</w:t>
+        </w:r>
+      </w:ins>
       <w:bookmarkEnd w:id="30"/>
       <w:commentRangeEnd w:id="32"/>
       <w:r>
@@ -1882,14 +2371,6 @@
           <w:szCs w:val="32"/>
         </w:rPr>
         <w:commentReference w:id="32"/>
-      </w:r>
-    </w:p>
-    <w:p>
-      <w:pPr>
-        <w:pStyle w:val="BodyText"/>
-      </w:pPr>
-      <w:r>
-        <w:t>The table gives selected examples from MVT’s review for which the attestation provides an explanation; it is not a complete inventory of CDAO’s self-identified issues. The conclusions assess consistency with documentation and do not establish that all underlying values are correct. Remaining clarification is stated explicitly.</w:t>
       </w:r>
     </w:p>
     <w:tbl>
@@ -1940,6 +2421,7 @@
               <w:rPr>
                 <w:b/>
                 <w:sz w:val="18"/>
+                <w:color w:val="1D252C"/>
               </w:rPr>
               <w:t>Finding</w:t>
             </w:r>
@@ -1966,6 +2448,7 @@
               <w:rPr>
                 <w:b/>
                 <w:sz w:val="18"/>
+                <w:color w:val="1D252C"/>
               </w:rPr>
               <w:t>Explanation / reference</w:t>
             </w:r>
@@ -1992,6 +2475,7 @@
               <w:rPr>
                 <w:b/>
                 <w:sz w:val="18"/>
+                <w:color w:val="1D252C"/>
               </w:rPr>
               <w:t>Conclusion</w:t>
             </w:r>
@@ -2021,8 +2505,92 @@
               <w:spacing w:after="0"/>
             </w:pPr>
             <w:r>
-              <w:t>Total account count: approximately 10.25% decrease in June 2019 versus May, from 119,437 to 107,191.</w:t>
-            </w:r>
+              <w:rPr>
+                <w:sz w:val="18"/>
+              </w:rPr>
+              <w:t xml:space="preserve">Total account count: approximately 10</w:t>
+            </w:r>
+            <w:ins w:id="182" w:author="MVT proposed edits" w:date="2026-10-29T15:28:23Z">
+              <w:r>
+                <w:t xml:space="preserve">.25</w:t>
+              </w:r>
+            </w:ins>
+            <w:r>
+              <w:rPr>
+                <w:sz w:val="18"/>
+              </w:rPr>
+              <w:t xml:space="preserve">% decrease in June </w:t>
+            </w:r>
+            <w:del w:id="183" w:author="MVT proposed edits" w:date="2026-10-29T15:28:23Z">
+              <w:r>
+                <w:rPr>
+                  <w:sz w:val="18"/>
+                </w:rPr>
+                <w:delText xml:space="preserve">2009</w:delText>
+              </w:r>
+            </w:del>
+            <w:ins w:id="184" w:author="MVT proposed edits" w:date="2026-10-29T15:28:23Z">
+              <w:r>
+                <w:t xml:space="preserve">2019</w:t>
+              </w:r>
+            </w:ins>
+            <w:r>
+              <w:rPr>
+                <w:sz w:val="18"/>
+              </w:rPr>
+              <w:t xml:space="preserve"> versus May, </w:t>
+            </w:r>
+            <w:del w:id="185" w:author="MVT proposed edits" w:date="2026-10-29T15:28:23Z">
+              <w:r>
+                <w:rPr>
+                  <w:sz w:val="18"/>
+                </w:rPr>
+                <w:delText xml:space="preserve">across</w:delText>
+              </w:r>
+            </w:del>
+            <w:ins w:id="186" w:author="MVT proposed edits" w:date="2026-10-29T15:28:23Z">
+              <w:r>
+                <w:t xml:space="preserve">from</w:t>
+              </w:r>
+            </w:ins>
+            <w:r>
+              <w:rPr>
+                <w:sz w:val="18"/>
+              </w:rPr>
+              <w:t xml:space="preserve"> </w:t>
+            </w:r>
+            <w:del w:id="187" w:author="MVT proposed edits" w:date="2026-10-29T15:28:23Z">
+              <w:r>
+                <w:rPr>
+                  <w:sz w:val="18"/>
+                </w:rPr>
+                <w:delText xml:space="preserve">all</w:delText>
+              </w:r>
+            </w:del>
+            <w:ins w:id="188" w:author="MVT proposed edits" w:date="2026-10-29T15:28:23Z">
+              <w:r>
+                <w:t xml:space="preserve">119,437</w:t>
+              </w:r>
+            </w:ins>
+            <w:r>
+              <w:rPr>
+                <w:sz w:val="18"/>
+              </w:rPr>
+              <w:t xml:space="preserve"> </w:t>
+            </w:r>
+            <w:del w:id="189" w:author="MVT proposed edits" w:date="2026-10-29T15:28:23Z">
+              <w:r>
+                <w:rPr>
+                  <w:sz w:val="18"/>
+                </w:rPr>
+                <w:delText xml:space="preserve">fields</w:delText>
+              </w:r>
+            </w:del>
+            <w:ins w:id="190" w:author="MVT proposed edits" w:date="2026-10-29T15:28:23Z">
+              <w:r>
+                <w:t xml:space="preserve">to 107,191.</w:t>
+              </w:r>
+            </w:ins>
           </w:p>
         </w:tc>
         <w:tc>
@@ -2042,8 +2610,171 @@
               <w:pStyle w:val="Compact"/>
               <w:spacing w:after="0"/>
             </w:pPr>
-            <w:r>
-              <w:t>W13/W43 identify May 2019 as the Glenbeigh migration month; W124/W126/W127 describe associated account closures. These comments provide relevant context but do not explicitly attribute the June 2019 total account-count decrease to that migration.</w:t>
+            <w:del w:id="191" w:author="MVT proposed edits" w:date="2026-10-29T15:28:23Z">
+              <w:r>
+                <w:rPr>
+                  <w:sz w:val="18"/>
+                </w:rPr>
+                <w:delText xml:space="preserve">CDAO</w:delText>
+              </w:r>
+            </w:del>
+            <w:ins w:id="192" w:author="MVT proposed edits" w:date="2026-10-29T15:28:23Z">
+              <w:r>
+                <w:t xml:space="preserve">The</w:t>
+              </w:r>
+            </w:ins>
+            <w:r>
+              <w:rPr>
+                <w:sz w:val="18"/>
+              </w:rPr>
+              <w:t xml:space="preserve"> </w:t>
+            </w:r>
+            <w:del w:id="193" w:author="MVT proposed edits" w:date="2026-10-29T15:28:23Z">
+              <w:r>
+                <w:rPr>
+                  <w:sz w:val="18"/>
+                </w:rPr>
+                <w:delText xml:space="preserve">explained</w:delText>
+              </w:r>
+            </w:del>
+            <w:ins w:id="194" w:author="MVT proposed edits" w:date="2026-10-29T15:28:23Z">
+              <w:r>
+                <w:t xml:space="preserve">attestation</w:t>
+              </w:r>
+            </w:ins>
+            <w:r>
+              <w:rPr>
+                <w:sz w:val="18"/>
+              </w:rPr>
+              <w:t xml:space="preserve"> </w:t>
+            </w:r>
+            <w:del w:id="195" w:author="MVT proposed edits" w:date="2026-10-29T15:28:23Z">
+              <w:r>
+                <w:rPr>
+                  <w:sz w:val="18"/>
+                </w:rPr>
+                <w:delText xml:space="preserve">that</w:delText>
+              </w:r>
+            </w:del>
+            <w:ins w:id="196" w:author="MVT proposed edits" w:date="2026-10-29T15:28:23Z">
+              <w:r>
+                <w:t xml:space="preserve">identifies</w:t>
+              </w:r>
+            </w:ins>
+            <w:r>
+              <w:rPr>
+                <w:sz w:val="18"/>
+              </w:rPr>
+              <w:t xml:space="preserve"> </w:t>
+            </w:r>
+            <w:del w:id="197" w:author="MVT proposed edits" w:date="2026-10-29T15:28:23Z">
+              <w:r>
+                <w:rPr>
+                  <w:sz w:val="18"/>
+                </w:rPr>
+                <w:delText xml:space="preserve">the</w:delText>
+              </w:r>
+            </w:del>
+            <w:ins w:id="198" w:author="MVT proposed edits" w:date="2026-10-29T15:28:23Z">
+              <w:r>
+                <w:t xml:space="preserve">May</w:t>
+              </w:r>
+            </w:ins>
+            <w:r>
+              <w:rPr>
+                <w:sz w:val="18"/>
+              </w:rPr>
+              <w:t xml:space="preserve"> </w:t>
+            </w:r>
+            <w:del w:id="199" w:author="MVT proposed edits" w:date="2026-10-29T15:28:23Z">
+              <w:r>
+                <w:rPr>
+                  <w:sz w:val="18"/>
+                </w:rPr>
+                <w:delText xml:space="preserve">decrease</w:delText>
+              </w:r>
+            </w:del>
+            <w:ins w:id="200" w:author="MVT proposed edits" w:date="2026-10-29T15:28:23Z">
+              <w:r>
+                <w:t xml:space="preserve">2019</w:t>
+              </w:r>
+            </w:ins>
+            <w:r>
+              <w:rPr>
+                <w:sz w:val="18"/>
+              </w:rPr>
+              <w:t xml:space="preserve"> </w:t>
+            </w:r>
+            <w:del w:id="201" w:author="MVT proposed edits" w:date="2026-10-29T15:28:23Z">
+              <w:r>
+                <w:rPr>
+                  <w:sz w:val="18"/>
+                </w:rPr>
+                <w:delText xml:space="preserve">was due to</w:delText>
+              </w:r>
+            </w:del>
+            <w:ins w:id="202" w:author="MVT proposed edits" w:date="2026-10-29T15:28:23Z">
+              <w:r>
+                <w:t xml:space="preserve">as</w:t>
+              </w:r>
+            </w:ins>
+            <w:r>
+              <w:rPr>
+                <w:sz w:val="18"/>
+              </w:rPr>
+              <w:t xml:space="preserve"> the Glenbeigh </w:t>
+            </w:r>
+            <w:del w:id="203" w:author="MVT proposed edits" w:date="2026-10-29T15:28:23Z">
+              <w:r>
+                <w:rPr>
+                  <w:sz w:val="18"/>
+                </w:rPr>
+                <w:delText xml:space="preserve">portfolio </w:delText>
+              </w:r>
+            </w:del>
+            <w:r>
+              <w:rPr>
+                <w:sz w:val="18"/>
+              </w:rPr>
+              <w:t xml:space="preserve">migration </w:t>
+            </w:r>
+            <w:del w:id="204" w:author="MVT proposed edits" w:date="2026-10-29T15:28:23Z">
+              <w:r>
+                <w:rPr>
+                  <w:sz w:val="18"/>
+                </w:rPr>
+                <w:delText xml:space="preserve">in</w:delText>
+              </w:r>
+            </w:del>
+            <w:ins w:id="205" w:author="MVT proposed edits" w:date="2026-10-29T15:28:23Z">
+              <w:r>
+                <w:t xml:space="preserve">month (W13/W43) and mentions associated account closures (W124/W126/W127). It does not explicitly attribute the</w:t>
+              </w:r>
+            </w:ins>
+            <w:r>
+              <w:rPr>
+                <w:sz w:val="18"/>
+              </w:rPr>
+              <w:t xml:space="preserve"> June </w:t>
+            </w:r>
+            <w:del w:id="206" w:author="MVT proposed edits" w:date="2026-10-29T15:28:23Z">
+              <w:r>
+                <w:rPr>
+                  <w:sz w:val="18"/>
+                </w:rPr>
+                <w:delText xml:space="preserve">2009</w:delText>
+              </w:r>
+            </w:del>
+            <w:ins w:id="207" w:author="MVT proposed edits" w:date="2026-10-29T15:28:23Z">
+              <w:r>
+                <w:t xml:space="preserve">2019 total account-count decrease to this event</w:t>
+              </w:r>
+            </w:ins>
+            <w:r>
+              <w:rPr>
+                <w:sz w:val="18"/>
+              </w:rPr>
+              <w:t xml:space="preserve">.</w:t>
             </w:r>
           </w:p>
         </w:tc>
@@ -2064,8 +2795,103 @@
               <w:pStyle w:val="Compact"/>
               <w:spacing w:after="0"/>
             </w:pPr>
-            <w:r>
-              <w:t>Consistent with documented portfolio movement; attribution remains to be confirmed. Advise CDAO to record the June 2019 decrease, its cause and affected account population explicitly in the attestation log, supported by a migration/cohort reconciliation.</w:t>
+            <w:del w:id="208" w:author="MVT proposed edits" w:date="2026-10-29T15:28:23Z">
+              <w:r>
+                <w:rPr>
+                  <w:sz w:val="18"/>
+                </w:rPr>
+                <w:delText xml:space="preserve">PASS</w:delText>
+              </w:r>
+            </w:del>
+            <w:ins w:id="209" w:author="MVT proposed edits" w:date="2026-10-29T15:28:23Z">
+              <w:r>
+                <w:t xml:space="preserve">Consistent</w:t>
+              </w:r>
+            </w:ins>
+            <w:r>
+              <w:rPr>
+                <w:sz w:val="18"/>
+              </w:rPr>
+              <w:t xml:space="preserve"> </w:t>
+            </w:r>
+            <w:del w:id="210" w:author="MVT proposed edits" w:date="2026-10-29T15:28:23Z">
+              <w:r>
+                <w:rPr>
+                  <w:sz w:val="18"/>
+                </w:rPr>
+                <w:delText xml:space="preserve">-</w:delText>
+              </w:r>
+            </w:del>
+            <w:ins w:id="211" w:author="MVT proposed edits" w:date="2026-10-29T15:28:23Z">
+              <w:r>
+                <w:t xml:space="preserve">with documented</w:t>
+              </w:r>
+            </w:ins>
+            <w:r>
+              <w:rPr>
+                <w:sz w:val="18"/>
+              </w:rPr>
+              <w:t xml:space="preserve"> portfolio movement</w:t>
+            </w:r>
+            <w:ins w:id="212" w:author="MVT proposed edits" w:date="2026-10-29T15:28:23Z">
+              <w:r>
+                <w:t xml:space="preserve">;</w:t>
+              </w:r>
+            </w:ins>
+            <w:r>
+              <w:rPr>
+                <w:sz w:val="18"/>
+              </w:rPr>
+              <w:t xml:space="preserve"> </w:t>
+            </w:r>
+            <w:del w:id="213" w:author="MVT proposed edits" w:date="2026-10-29T15:28:23Z">
+              <w:r>
+                <w:rPr>
+                  <w:sz w:val="18"/>
+                </w:rPr>
+                <w:delText xml:space="preserve">explained</w:delText>
+              </w:r>
+            </w:del>
+            <w:ins w:id="214" w:author="MVT proposed edits" w:date="2026-10-29T15:28:23Z">
+              <w:r>
+                <w:t xml:space="preserve">attribution</w:t>
+              </w:r>
+            </w:ins>
+            <w:r>
+              <w:rPr>
+                <w:sz w:val="18"/>
+              </w:rPr>
+              <w:t xml:space="preserve"> </w:t>
+            </w:r>
+            <w:del w:id="215" w:author="MVT proposed edits" w:date="2026-10-29T15:28:23Z">
+              <w:r>
+                <w:rPr>
+                  <w:sz w:val="18"/>
+                </w:rPr>
+                <w:delText xml:space="preserve">by</w:delText>
+              </w:r>
+            </w:del>
+            <w:ins w:id="216" w:author="MVT proposed edits" w:date="2026-10-29T15:28:23Z">
+              <w:r>
+                <w:t xml:space="preserve">not explicitly confirmed. Advise</w:t>
+              </w:r>
+            </w:ins>
+            <w:r>
+              <w:rPr>
+                <w:sz w:val="18"/>
+              </w:rPr>
+              <w:t xml:space="preserve"> CDAO</w:t>
+            </w:r>
+            <w:ins w:id="217" w:author="MVT proposed edits" w:date="2026-10-29T15:28:23Z">
+              <w:r>
+                <w:t xml:space="preserve"> to record the reason for the June 2019 account-count decrease and the affected population explicitly in the attestation log</w:t>
+              </w:r>
+            </w:ins>
+            <w:r>
+              <w:rPr>
+                <w:sz w:val="18"/>
+              </w:rPr>
+              <w:t xml:space="preserve">.</w:t>
             </w:r>
           </w:p>
         </w:tc>
@@ -2142,8 +2968,43 @@
               <w:pStyle w:val="Compact"/>
               <w:spacing w:after="0"/>
             </w:pPr>
-            <w:r>
-              <w:t>Introduction timing is consistent with the documented start date; this does not validate all field values.</w:t>
+            <w:del w:id="218" w:author="MVT proposed edits" w:date="2026-10-29T15:28:23Z">
+              <w:r>
+                <w:rPr>
+                  <w:sz w:val="18"/>
+                </w:rPr>
+                <w:delText xml:space="preserve">PASS - introduction</w:delText>
+              </w:r>
+            </w:del>
+            <w:ins w:id="219" w:author="MVT proposed edits" w:date="2026-10-29T15:28:23Z">
+              <w:r>
+                <w:t xml:space="preserve">Introduction</w:t>
+              </w:r>
+            </w:ins>
+            <w:r>
+              <w:rPr>
+                <w:sz w:val="18"/>
+              </w:rPr>
+              <w:t xml:space="preserve"> timing </w:t>
+            </w:r>
+            <w:del w:id="220" w:author="MVT proposed edits" w:date="2026-10-29T15:28:23Z">
+              <w:r>
+                <w:rPr>
+                  <w:sz w:val="18"/>
+                </w:rPr>
+                <w:delText xml:space="preserve">explained</w:delText>
+              </w:r>
+            </w:del>
+            <w:ins w:id="221" w:author="MVT proposed edits" w:date="2026-10-29T15:28:23Z">
+              <w:r>
+                <w:t xml:space="preserve">consistent with the documented start date</w:t>
+              </w:r>
+            </w:ins>
+            <w:r>
+              <w:rPr>
+                <w:sz w:val="18"/>
+              </w:rPr>
+              <w:t xml:space="preserve">.</w:t>
             </w:r>
           </w:p>
         </w:tc>
@@ -2233,8 +3094,43 @@
               <w:pStyle w:val="Compact"/>
               <w:spacing w:after="0"/>
             </w:pPr>
-            <w:r>
-              <w:t>Historical special-value pattern is consistent with documented availability.</w:t>
+            <w:del w:id="222" w:author="MVT proposed edits" w:date="2026-10-29T15:28:23Z">
+              <w:r>
+                <w:rPr>
+                  <w:sz w:val="18"/>
+                </w:rPr>
+                <w:delText xml:space="preserve">PASS - historical</w:delText>
+              </w:r>
+            </w:del>
+            <w:ins w:id="223" w:author="MVT proposed edits" w:date="2026-10-29T15:28:23Z">
+              <w:r>
+                <w:t xml:space="preserve">Historical</w:t>
+              </w:r>
+            </w:ins>
+            <w:r>
+              <w:rPr>
+                <w:sz w:val="18"/>
+              </w:rPr>
+              <w:t xml:space="preserve"> coverage </w:t>
+            </w:r>
+            <w:del w:id="224" w:author="MVT proposed edits" w:date="2026-10-29T15:28:23Z">
+              <w:r>
+                <w:rPr>
+                  <w:sz w:val="18"/>
+                </w:rPr>
+                <w:delText xml:space="preserve">explained</w:delText>
+              </w:r>
+            </w:del>
+            <w:ins w:id="225" w:author="MVT proposed edits" w:date="2026-10-29T15:28:23Z">
+              <w:r>
+                <w:t xml:space="preserve">pattern consistent with the documented availability</w:t>
+              </w:r>
+            </w:ins>
+            <w:r>
+              <w:rPr>
+                <w:sz w:val="18"/>
+              </w:rPr>
+              <w:t xml:space="preserve">.</w:t>
             </w:r>
           </w:p>
         </w:tc>
@@ -2318,8 +3214,54 @@
               <w:pStyle w:val="Compact"/>
               <w:spacing w:after="0"/>
             </w:pPr>
-            <w:r>
-              <w:t>High baseline missingness is consistent with documented field applicability.</w:t>
+            <w:del w:id="226" w:author="MVT proposed edits" w:date="2026-10-29T15:28:23Z">
+              <w:r>
+                <w:rPr>
+                  <w:sz w:val="18"/>
+                </w:rPr>
+                <w:delText xml:space="preserve">PASS</w:delText>
+              </w:r>
+            </w:del>
+            <w:ins w:id="227" w:author="MVT proposed edits" w:date="2026-10-29T15:28:23Z">
+              <w:r>
+                <w:t xml:space="preserve">High</w:t>
+              </w:r>
+            </w:ins>
+            <w:r>
+              <w:rPr>
+                <w:sz w:val="18"/>
+              </w:rPr>
+              <w:t xml:space="preserve"> </w:t>
+            </w:r>
+            <w:del w:id="228" w:author="MVT proposed edits" w:date="2026-10-29T15:28:23Z">
+              <w:r>
+                <w:rPr>
+                  <w:sz w:val="18"/>
+                </w:rPr>
+                <w:delText xml:space="preserve">- expected</w:delText>
+              </w:r>
+            </w:del>
+            <w:ins w:id="229" w:author="MVT proposed edits" w:date="2026-10-29T15:28:23Z">
+              <w:r>
+                <w:t xml:space="preserve">baseline</w:t>
+              </w:r>
+            </w:ins>
+            <w:r>
+              <w:rPr>
+                <w:sz w:val="18"/>
+              </w:rPr>
+              <w:t xml:space="preserve"> missingness</w:t>
+            </w:r>
+            <w:ins w:id="230" w:author="MVT proposed edits" w:date="2026-10-29T15:28:23Z">
+              <w:r>
+                <w:t xml:space="preserve"> consistent with the documented field applicability</w:t>
+              </w:r>
+            </w:ins>
+            <w:r>
+              <w:rPr>
+                <w:sz w:val="18"/>
+              </w:rPr>
+              <w:t xml:space="preserve">.</w:t>
             </w:r>
           </w:p>
         </w:tc>
@@ -2403,8 +3345,57 @@
               <w:pStyle w:val="Compact"/>
               <w:spacing w:after="0"/>
             </w:pPr>
-            <w:r>
-              <w:t>High baseline special rates are consistent with eligibility; November 2018 remains under issue 1.</w:t>
+            <w:del w:id="231" w:author="MVT proposed edits" w:date="2026-10-29T15:28:23Z">
+              <w:r>
+                <w:rPr>
+                  <w:sz w:val="18"/>
+                </w:rPr>
+                <w:delText xml:space="preserve">PASS</w:delText>
+              </w:r>
+            </w:del>
+            <w:ins w:id="232" w:author="MVT proposed edits" w:date="2026-10-29T15:28:23Z">
+              <w:r>
+                <w:t xml:space="preserve">High</w:t>
+              </w:r>
+            </w:ins>
+            <w:r>
+              <w:rPr>
+                <w:sz w:val="18"/>
+              </w:rPr>
+              <w:t xml:space="preserve"> </w:t>
+            </w:r>
+            <w:del w:id="233" w:author="MVT proposed edits" w:date="2026-10-29T15:28:23Z">
+              <w:r>
+                <w:rPr>
+                  <w:sz w:val="18"/>
+                </w:rPr>
+                <w:delText xml:space="preserve">-</w:delText>
+              </w:r>
+            </w:del>
+            <w:ins w:id="234" w:author="MVT proposed edits" w:date="2026-10-29T15:28:23Z">
+              <w:r>
+                <w:t xml:space="preserve">baseline special rates consistent with</w:t>
+              </w:r>
+            </w:ins>
+            <w:r>
+              <w:rPr>
+                <w:sz w:val="18"/>
+              </w:rPr>
+              <w:t xml:space="preserve"> eligibility</w:t>
+            </w:r>
+            <w:del w:id="235" w:author="MVT proposed edits" w:date="2026-10-29T15:28:23Z">
+              <w:r>
+                <w:rPr>
+                  <w:sz w:val="18"/>
+                </w:rPr>
+                <w:delText xml:space="preserve"> explained</w:delText>
+              </w:r>
+            </w:del>
+            <w:r>
+              <w:rPr>
+                <w:sz w:val="18"/>
+              </w:rPr>
+              <w:t xml:space="preserve">; November 2018 remains under issue 1.</w:t>
             </w:r>
           </w:p>
         </w:tc>
@@ -2503,8 +3494,90 @@
             </w:pPr>
             <w:commentRangeStart w:id="33"/>
             <w:r>
-              <w:t>Historical loading error documented. The attestation does not state whether it was corrected or cannot be corrected. Check whether clarification is already logged; if not, ask CDAO to confirm correction status and any limitations on use.</w:t>
-            </w:r>
+              <w:rPr>
+                <w:sz w:val="18"/>
+              </w:rPr>
+              <w:t xml:space="preserve">Known historical error </w:t>
+            </w:r>
+            <w:del w:id="236" w:author="MVT proposed edits" w:date="2026-10-29T15:28:23Z">
+              <w:r>
+                <w:rPr>
+                  <w:sz w:val="18"/>
+                </w:rPr>
+                <w:delText xml:space="preserve">-</w:delText>
+              </w:r>
+            </w:del>
+            <w:ins w:id="237" w:author="MVT proposed edits" w:date="2026-10-29T15:28:23Z">
+              <w:r>
+                <w:t xml:space="preserve">—</w:t>
+              </w:r>
+            </w:ins>
+            <w:r>
+              <w:rPr>
+                <w:sz w:val="18"/>
+              </w:rPr>
+              <w:t xml:space="preserve"> cause </w:t>
+            </w:r>
+            <w:del w:id="238" w:author="MVT proposed edits" w:date="2026-10-29T15:28:23Z">
+              <w:r>
+                <w:rPr>
+                  <w:sz w:val="18"/>
+                </w:rPr>
+                <w:delText xml:space="preserve">explained</w:delText>
+              </w:r>
+            </w:del>
+            <w:ins w:id="239" w:author="MVT proposed edits" w:date="2026-10-29T15:28:23Z">
+              <w:r>
+                <w:t xml:space="preserve">documented</w:t>
+              </w:r>
+            </w:ins>
+            <w:r>
+              <w:rPr>
+                <w:sz w:val="18"/>
+              </w:rPr>
+              <w:t xml:space="preserve">; </w:t>
+            </w:r>
+            <w:r>
+              <w:rPr>
+                <w:sz w:val="18"/>
+              </w:rPr>
+              <w:t xml:space="preserve">correction </w:t>
+            </w:r>
+            <w:ins w:id="240" w:author="MVT proposed edits" w:date="2026-10-29T15:28:23Z">
+              <w:r>
+                <w:t xml:space="preserve">status </w:t>
+              </w:r>
+            </w:ins>
+            <w:r>
+              <w:rPr>
+                <w:sz w:val="18"/>
+              </w:rPr>
+              <w:t xml:space="preserve">not </w:t>
+            </w:r>
+            <w:del w:id="241" w:author="MVT proposed edits" w:date="2026-10-29T15:28:23Z">
+              <w:r>
+                <w:rPr>
+                  <w:sz w:val="18"/>
+                </w:rPr>
+                <w:delText xml:space="preserve">confirmed</w:delText>
+              </w:r>
+            </w:del>
+            <w:ins w:id="242" w:author="MVT proposed edits" w:date="2026-10-29T15:28:23Z">
+              <w:r>
+                <w:t xml:space="preserve">stated in the attestation</w:t>
+              </w:r>
+            </w:ins>
+            <w:r>
+              <w:rPr>
+                <w:sz w:val="18"/>
+              </w:rPr>
+              <w:t xml:space="preserve">.</w:t>
+            </w:r>
+            <w:ins w:id="243" w:author="MVT proposed edits" w:date="2026-10-29T15:28:23Z">
+              <w:r>
+                <w:t xml:space="preserve"> Seek clarification if not already available.</w:t>
+              </w:r>
+            </w:ins>
             <w:commentRangeEnd w:id="33"/>
             <w:r>
               <w:rPr>
@@ -3705,7 +4778,7 @@
     </w:pPr>
     <w:rPr>
       <w:rFonts w:ascii="Calibri" w:eastAsia="Calibri" w:hAnsi="Calibri" w:cs="Calibri"/>
-      <w:color w:val="000000"/>
+      <w:color w:val="1D252C"/>
       <w:sz w:val="20"/>
     </w:rPr>
   </w:style>
@@ -3843,7 +4916,7 @@
       <w:rFonts w:eastAsiaTheme="majorEastAsia" w:cstheme="majorBidi"/>
       <w:i/>
       <w:iCs/>
-      <w:color w:val="595959" w:themeColor="text1" w:themeTint="A6"/>
+      <w:color w:val="FC4C02"/>
     </w:rPr>
   </w:style>
   <w:style w:type="paragraph" w:styleId="Heading7">
@@ -3864,7 +4937,7 @@
     </w:pPr>
     <w:rPr>
       <w:rFonts w:eastAsiaTheme="majorEastAsia" w:cstheme="majorBidi"/>
-      <w:color w:val="595959" w:themeColor="text1" w:themeTint="A6"/>
+      <w:color w:val="FC4C02"/>
     </w:rPr>
   </w:style>
   <w:style w:type="paragraph" w:styleId="Heading8">
@@ -3887,7 +4960,7 @@
       <w:rFonts w:eastAsiaTheme="majorEastAsia" w:cstheme="majorBidi"/>
       <w:i/>
       <w:iCs/>
-      <w:color w:val="272727" w:themeColor="text1" w:themeTint="D8"/>
+      <w:color w:val="FC4C02"/>
     </w:rPr>
   </w:style>
   <w:style w:type="paragraph" w:styleId="Heading9">
@@ -3908,7 +4981,7 @@
     </w:pPr>
     <w:rPr>
       <w:rFonts w:eastAsiaTheme="majorEastAsia" w:cstheme="majorBidi"/>
-      <w:color w:val="272727" w:themeColor="text1" w:themeTint="D8"/>
+      <w:color w:val="FC4C02"/>
     </w:rPr>
   </w:style>
   <w:style w:type="character" w:default="1" w:styleId="DefaultParagraphFont">
@@ -3945,12 +5018,18 @@
     <w:pPr>
       <w:spacing w:before="180" w:after="180"/>
     </w:pPr>
+    <w:rPr>
+      <w:color w:val="1D252C"/>
+    </w:rPr>
   </w:style>
   <w:style w:type="paragraph" w:customStyle="1" w:styleId="FirstParagraph">
     <w:name w:val="First Paragraph"/>
     <w:basedOn w:val="BodyText"/>
     <w:next w:val="BodyText"/>
     <w:qFormat/>
+    <w:rPr>
+      <w:color w:val="1D252C"/>
+    </w:rPr>
   </w:style>
   <w:style w:type="paragraph" w:customStyle="1" w:styleId="Compact">
     <w:name w:val="Compact"/>
@@ -3959,6 +5038,9 @@
     <w:pPr>
       <w:spacing w:before="36" w:after="36"/>
     </w:pPr>
+    <w:rPr>
+      <w:color w:val="1D252C"/>
+    </w:rPr>
   </w:style>
   <w:style w:type="paragraph" w:styleId="Title">
     <w:name w:val="Title"/>
@@ -4169,7 +5251,7 @@
       <w:rFonts w:ascii="Calibri" w:eastAsiaTheme="majorEastAsia" w:hAnsi="Calibri" w:cstheme="majorBidi"/>
       <w:i/>
       <w:iCs/>
-      <w:color w:val="595959" w:themeColor="text1" w:themeTint="A6"/>
+      <w:color w:val="FC4C02"/>
     </w:rPr>
   </w:style>
   <w:style w:type="character" w:customStyle="1" w:styleId="Heading7Char">
@@ -4181,7 +5263,7 @@
     <w:rsid w:val="00A10FD9"/>
     <w:rPr>
       <w:rFonts w:ascii="Calibri" w:eastAsiaTheme="majorEastAsia" w:hAnsi="Calibri" w:cstheme="majorBidi"/>
-      <w:color w:val="595959" w:themeColor="text1" w:themeTint="A6"/>
+      <w:color w:val="FC4C02"/>
     </w:rPr>
   </w:style>
   <w:style w:type="character" w:customStyle="1" w:styleId="Heading8Char">
@@ -4195,7 +5277,7 @@
       <w:rFonts w:ascii="Calibri" w:eastAsiaTheme="majorEastAsia" w:hAnsi="Calibri" w:cstheme="majorBidi"/>
       <w:i/>
       <w:iCs/>
-      <w:color w:val="272727" w:themeColor="text1" w:themeTint="D8"/>
+      <w:color w:val="FC4C02"/>
     </w:rPr>
   </w:style>
   <w:style w:type="character" w:customStyle="1" w:styleId="Heading9Char">
@@ -4207,7 +5289,7 @@
     <w:rsid w:val="00A10FD9"/>
     <w:rPr>
       <w:rFonts w:ascii="Calibri" w:eastAsiaTheme="majorEastAsia" w:hAnsi="Calibri" w:cstheme="majorBidi"/>
-      <w:color w:val="272727" w:themeColor="text1" w:themeTint="D8"/>
+      <w:color w:val="FC4C02"/>
     </w:rPr>
   </w:style>
   <w:style w:type="paragraph" w:styleId="BlockText">
@@ -4701,7 +5783,7 @@
     <w:rsid w:val="007A6652"/>
     <w:rPr>
       <w:rFonts w:ascii="Calibri" w:eastAsia="Calibri" w:hAnsi="Calibri" w:cs="Calibri"/>
-      <w:color w:val="000000"/>
+      <w:color w:val="1D252C"/>
       <w:sz w:val="20"/>
     </w:rPr>
   </w:style>
@@ -4733,7 +5815,7 @@
     <w:rsid w:val="001E5ED8"/>
     <w:rPr>
       <w:rFonts w:ascii="Calibri" w:eastAsia="Calibri" w:hAnsi="Calibri" w:cs="Calibri"/>
-      <w:color w:val="000000"/>
+      <w:color w:val="1D252C"/>
       <w:sz w:val="20"/>
       <w:szCs w:val="20"/>
     </w:rPr>
@@ -4758,7 +5840,7 @@
       <w:rFonts w:ascii="Calibri" w:eastAsia="Calibri" w:hAnsi="Calibri" w:cs="Calibri"/>
       <w:b/>
       <w:bCs/>
-      <w:color w:val="000000"/>
+      <w:color w:val="1D252C"/>
       <w:sz w:val="20"/>
       <w:szCs w:val="20"/>
     </w:rPr>
@@ -4772,7 +5854,7 @@
     </w:pPr>
     <w:rPr>
       <w:rFonts w:ascii="Calibri" w:eastAsia="Calibri" w:hAnsi="Calibri" w:cs="Calibri"/>
-      <w:color w:val="000000"/>
+      <w:color w:val="1D252C"/>
       <w:sz w:val="20"/>
     </w:rPr>
   </w:style>

</xml_diff>

<commit_message>
Propose November 2019 payment finding and broaden recurring payment-spike review
</commit_message>
<xml_diff>
--- a/DQ_ENGINE/review_results/RDS/2026-10-20/RDS_MoM_review_JH_revised.docx
+++ b/DQ_ENGINE/review_results/RDS/2026-10-20/RDS_MoM_review_JH_revised.docx
@@ -153,9 +153,16 @@
           <w:t>f</w:t>
         </w:r>
       </w:ins>
-      <w:r>
-        <w:t xml:space="preserve">ive findings </w:t>
-      </w:r>
+      <w:del w:id="343" w:author="MVT proposed additions" w:date="2026-10-29T16:39:26Z">
+        <w:r>
+          <w:delText xml:space="preserve">ive findings </w:delText>
+        </w:r>
+      </w:del>
+      <w:ins w:id="344" w:author="MVT proposed additions" w:date="2026-10-29T16:39:26Z">
+        <w:r>
+          <w:t xml:space="preserve">indings </w:t>
+        </w:r>
+      </w:ins>
       <w:ins w:id="11" w:author="Hayes, Julian" w:date="2026-10-29T10:25:00Z" w16du:dateUtc="2026-10-29T10:25:00Z">
         <w:r>
           <w:t xml:space="preserve">were identified which </w:t>
@@ -1627,28 +1634,70 @@
         <w:pStyle w:val="Heading2"/>
       </w:pPr>
       <w:bookmarkStart w:id="29" w:name="X1e27537137114b9e6bd98799ef55e67f4c56995"/>
+      <w:r>
+        <w:rPr>
+          <w:rFonts w:ascii="Calibri" w:eastAsia="Calibri" w:hAnsi="Calibri" w:cs="Calibri"/>
+        </w:rPr>
+        <w:t xml:space="preserve">4. </w:t>
+      </w:r>
+      <w:del w:id="345" w:author="MVT proposed additions" w:date="2026-10-29T16:39:26Z">
+        <w:r>
+          <w:rPr>
+            <w:rFonts w:ascii="Calibri" w:eastAsia="Calibri" w:hAnsi="Calibri" w:cs="Calibri"/>
+          </w:rPr>
+          <w:delText xml:space="preserve">June</w:delText>
+        </w:r>
+      </w:del>
+      <w:ins w:id="346" w:author="MVT proposed additions" w:date="2026-10-29T16:39:26Z">
+        <w:r>
+          <w:rPr>
+            <w:rFonts w:ascii="Calibri" w:eastAsia="Calibri" w:hAnsi="Calibri" w:cs="Calibri"/>
+          </w:rPr>
+          <w:t xml:space="preserve">Recurring</w:t>
+        </w:r>
+      </w:ins>
+      <w:r>
+        <w:rPr>
+          <w:rFonts w:ascii="Calibri" w:eastAsia="Calibri" w:hAnsi="Calibri" w:cs="Calibri"/>
+        </w:rPr>
+        <w:t xml:space="preserve"> </w:t>
+      </w:r>
+      <w:del w:id="347" w:author="MVT proposed additions" w:date="2026-10-29T16:39:26Z">
+        <w:r>
+          <w:rPr>
+            <w:rFonts w:ascii="Calibri" w:eastAsia="Calibri" w:hAnsi="Calibri" w:cs="Calibri"/>
+          </w:rPr>
+          <w:delText xml:space="preserve">2024 increase</w:delText>
+        </w:r>
+      </w:del>
+      <w:ins w:id="348" w:author="MVT proposed additions" w:date="2026-10-29T16:39:26Z">
+        <w:r>
+          <w:rPr>
+            <w:rFonts w:ascii="Calibri" w:eastAsia="Calibri" w:hAnsi="Calibri" w:cs="Calibri"/>
+          </w:rPr>
+          <w:t xml:space="preserve">increases</w:t>
+        </w:r>
+      </w:ins>
+      <w:r>
+        <w:rPr>
+          <w:rFonts w:ascii="Calibri" w:eastAsia="Calibri" w:hAnsi="Calibri" w:cs="Calibri"/>
+        </w:rPr>
+        <w:t xml:space="preserve"> in zero payments and derived special values</w:t>
+      </w:r>
       <w:bookmarkEnd w:id="21"/>
-      <w:r>
-        <w:rPr>
-          <w:rFonts w:ascii="Calibri" w:eastAsia="Calibri" w:hAnsi="Calibri" w:cs="Calibri"/>
-        </w:rPr>
-        <w:t>4. June 2024 increase in zero payments and derived special values</w:t>
-      </w:r>
     </w:p>
     <w:p>
       <w:pPr>
         <w:pStyle w:val="FirstParagraph"/>
       </w:pPr>
       <w:r>
-        <w:rPr>
-          <w:b/>
-          <w:bCs/>
-        </w:rPr>
-        <w:t>Observation:</w:t>
-      </w:r>
-      <w:r>
-        <w:t xml:space="preserve"> Zero payment counts increased sharply in June 2024 and returned close to their previous levels in July:</w:t>
-      </w:r>
+        <w:t xml:space="preserve">Observation: Zero payment counts increased sharply in June 2024 and returned close to their previous levels in July:</w:t>
+      </w:r>
+      <w:ins w:id="349" w:author="MVT proposed additions" w:date="2026-10-29T16:39:26Z">
+        <w:r>
+          <w:t xml:space="preserve"> June 2024 is one example of a recurring pattern in the wider MoM results.</w:t>
+        </w:r>
+      </w:ins>
     </w:p>
     <w:tbl>
       <w:tblPr>
@@ -2159,27 +2208,61 @@
     <w:p>
       <w:pPr>
         <w:pStyle w:val="BodyText"/>
-      </w:pPr>
-      <w:r>
-        <w:t xml:space="preserve">CDAO’s comments for the payment fields (W49 and W251) explain a June 2012 PROBE loading error and elevated zeros during 2014-2019, but do not address June 2024. The attested ratio calculation (O423) assigns special value </w:t>
-      </w:r>
-      <w:r>
-        <w:rPr>
-          <w:rStyle w:val="VerbatimChar"/>
-        </w:rPr>
-        <w:t>-999999</w:t>
-      </w:r>
-      <w:r>
-        <w:t xml:space="preserve"> when </w:t>
-      </w:r>
-      <w:r>
-        <w:rPr>
-          <w:rStyle w:val="VerbatimChar"/>
-        </w:rPr>
-        <w:t>PROBE_CNP_AMT</w:t>
-      </w:r>
-      <w:r>
-        <w:t xml:space="preserve"> is zero, providing a link between zero payments and the increase in derived special values.</w:t>
+        <w:rPr>
+          <w:ins w:id="394" w:author="MVT proposed additions" w:date="2026-10-29T16:39:26Z"/>
+        </w:rPr>
+      </w:pPr>
+      <w:ins w:id="395" w:author="MVT proposed additions" w:date="2026-10-29T16:39:26Z">
+        <w:r>
+          <w:t xml:space="preserve">Other examples occur in January 2022, June 2025 and November 2025. PROBE_CNP_AMT zero counts move from 3,511 to 13,011 to 3,226; 2,306 to 10,115 to 2,533; and 2,400 to 10,486 to 2,570, respectively. Each sequence shows the preceding month, spike month and following month. Package-payment zeros and derived special values also increase in these spike months; overlap of the affected accounts has not been established.</w:t>
+        </w:r>
+      </w:ins>
+    </w:p>
+    <w:p>
+      <w:pPr>
+        <w:pStyle w:val="BodyText"/>
+      </w:pPr>
+      <w:r>
+        <w:t xml:space="preserve">CDAO’s comments for the payment fields (W49 and W251) explain a June 2012 PROBE loading error and elevated zeros during 2014-2019, but do not </w:t>
+      </w:r>
+      <w:del w:id="350" w:author="MVT proposed additions" w:date="2026-10-29T16:39:26Z">
+        <w:r>
+          <w:delText xml:space="preserve">address</w:delText>
+        </w:r>
+      </w:del>
+      <w:ins w:id="351" w:author="MVT proposed additions" w:date="2026-10-29T16:39:26Z">
+        <w:r>
+          <w:t xml:space="preserve">explain</w:t>
+        </w:r>
+      </w:ins>
+      <w:r>
+        <w:t xml:space="preserve"> </w:t>
+      </w:r>
+      <w:del w:id="352" w:author="MVT proposed additions" w:date="2026-10-29T16:39:26Z">
+        <w:r>
+          <w:delText xml:space="preserve">June</w:delText>
+        </w:r>
+      </w:del>
+      <w:ins w:id="353" w:author="MVT proposed additions" w:date="2026-10-29T16:39:26Z">
+        <w:r>
+          <w:t xml:space="preserve">the</w:t>
+        </w:r>
+      </w:ins>
+      <w:r>
+        <w:t xml:space="preserve"> </w:t>
+      </w:r>
+      <w:del w:id="354" w:author="MVT proposed additions" w:date="2026-10-29T16:39:26Z">
+        <w:r>
+          <w:delText xml:space="preserve">2024</w:delText>
+        </w:r>
+      </w:del>
+      <w:ins w:id="355" w:author="MVT proposed additions" w:date="2026-10-29T16:39:26Z">
+        <w:r>
+          <w:t xml:space="preserve">later recurring movements</w:t>
+        </w:r>
+      </w:ins>
+      <w:r>
+        <w:t xml:space="preserve">. The attested ratio calculation (O423) assigns special value -999999 when PROBE_CNP_AMT is zero, providing a link between zero payments and the increase in derived special values.</w:t>
       </w:r>
     </w:p>
     <w:p>
@@ -2203,16 +2286,151 @@
         </w:numPr>
       </w:pPr>
       <w:r>
-        <w:t xml:space="preserve">Explain the temporary increase in zero </w:t>
-      </w:r>
-      <w:r>
-        <w:rPr>
-          <w:rStyle w:val="VerbatimChar"/>
-        </w:rPr>
-        <w:t>PROBE_CNP_AMT</w:t>
-      </w:r>
-      <w:r>
-        <w:t xml:space="preserve"> values in June 2024, confirming whether it reflects expected payment behaviour/timing or a source-data processing issue.</w:t>
+        <w:t xml:space="preserve">Explain the </w:t>
+      </w:r>
+      <w:del w:id="356" w:author="MVT proposed additions" w:date="2026-10-29T16:39:26Z">
+        <w:r>
+          <w:delText xml:space="preserve">temporary</w:delText>
+        </w:r>
+      </w:del>
+      <w:ins w:id="357" w:author="MVT proposed additions" w:date="2026-10-29T16:39:26Z">
+        <w:r>
+          <w:t xml:space="preserve">recurring</w:t>
+        </w:r>
+      </w:ins>
+      <w:r>
+        <w:t xml:space="preserve"> </w:t>
+      </w:r>
+      <w:del w:id="358" w:author="MVT proposed additions" w:date="2026-10-29T16:39:26Z">
+        <w:r>
+          <w:delText xml:space="preserve">increase</w:delText>
+        </w:r>
+      </w:del>
+      <w:ins w:id="359" w:author="MVT proposed additions" w:date="2026-10-29T16:39:26Z">
+        <w:r>
+          <w:t xml:space="preserve">increases</w:t>
+        </w:r>
+      </w:ins>
+      <w:r>
+        <w:t xml:space="preserve"> in zero PROBE_CNP_AMT </w:t>
+      </w:r>
+      <w:ins w:id="360" w:author="MVT proposed additions" w:date="2026-10-29T16:39:26Z">
+        <w:r>
+          <w:t xml:space="preserve">and PCKG_CNP_AMT </w:t>
+        </w:r>
+      </w:ins>
+      <w:r>
+        <w:t xml:space="preserve">values</w:t>
+      </w:r>
+      <w:ins w:id="361" w:author="MVT proposed additions" w:date="2026-10-29T16:39:26Z">
+        <w:r>
+          <w:t xml:space="preserve">,</w:t>
+        </w:r>
+      </w:ins>
+      <w:r>
+        <w:t xml:space="preserve"> </w:t>
+      </w:r>
+      <w:del w:id="362" w:author="MVT proposed additions" w:date="2026-10-29T16:39:26Z">
+        <w:r>
+          <w:delText xml:space="preserve">in</w:delText>
+        </w:r>
+      </w:del>
+      <w:ins w:id="363" w:author="MVT proposed additions" w:date="2026-10-29T16:39:26Z">
+        <w:r>
+          <w:t xml:space="preserve">including</w:t>
+        </w:r>
+      </w:ins>
+      <w:r>
+        <w:t xml:space="preserve"> June 2024</w:t>
+      </w:r>
+      <w:del w:id="364" w:author="MVT proposed additions" w:date="2026-10-29T16:39:26Z">
+        <w:r>
+          <w:delText xml:space="preserve">,</w:delText>
+        </w:r>
+      </w:del>
+      <w:r>
+        <w:t xml:space="preserve"> </w:t>
+      </w:r>
+      <w:del w:id="365" w:author="MVT proposed additions" w:date="2026-10-29T16:39:26Z">
+        <w:r>
+          <w:delText xml:space="preserve">confirming</w:delText>
+        </w:r>
+      </w:del>
+      <w:ins w:id="366" w:author="MVT proposed additions" w:date="2026-10-29T16:39:26Z">
+        <w:r>
+          <w:t xml:space="preserve">and the additional periods noted above. Confirm</w:t>
+        </w:r>
+      </w:ins>
+      <w:r>
+        <w:t xml:space="preserve"> whether </w:t>
+      </w:r>
+      <w:del w:id="367" w:author="MVT proposed additions" w:date="2026-10-29T16:39:26Z">
+        <w:r>
+          <w:delText xml:space="preserve">it</w:delText>
+        </w:r>
+      </w:del>
+      <w:ins w:id="368" w:author="MVT proposed additions" w:date="2026-10-29T16:39:26Z">
+        <w:r>
+          <w:t xml:space="preserve">payment</w:t>
+        </w:r>
+      </w:ins>
+      <w:r>
+        <w:t xml:space="preserve"> </w:t>
+      </w:r>
+      <w:del w:id="369" w:author="MVT proposed additions" w:date="2026-10-29T16:39:26Z">
+        <w:r>
+          <w:delText xml:space="preserve">reflects</w:delText>
+        </w:r>
+      </w:del>
+      <w:ins w:id="370" w:author="MVT proposed additions" w:date="2026-10-29T16:39:26Z">
+        <w:r>
+          <w:t xml:space="preserve">collection dates, month-end/calendar effects,</w:t>
+        </w:r>
+      </w:ins>
+      <w:r>
+        <w:t xml:space="preserve"> expected </w:t>
+      </w:r>
+      <w:del w:id="371" w:author="MVT proposed additions" w:date="2026-10-29T16:39:26Z">
+        <w:r>
+          <w:delText xml:space="preserve">payment</w:delText>
+        </w:r>
+      </w:del>
+      <w:ins w:id="372" w:author="MVT proposed additions" w:date="2026-10-29T16:39:26Z">
+        <w:r>
+          <w:t xml:space="preserve">customer</w:t>
+        </w:r>
+      </w:ins>
+      <w:r>
+        <w:t xml:space="preserve"> behaviour</w:t>
+      </w:r>
+      <w:del w:id="373" w:author="MVT proposed additions" w:date="2026-10-29T16:39:26Z">
+        <w:r>
+          <w:delText xml:space="preserve">/timing</w:delText>
+        </w:r>
+      </w:del>
+      <w:r>
+        <w:t xml:space="preserve"> or </w:t>
+      </w:r>
+      <w:del w:id="374" w:author="MVT proposed additions" w:date="2026-10-29T16:39:26Z">
+        <w:r>
+          <w:delText xml:space="preserve">a source-data </w:delText>
+        </w:r>
+      </w:del>
+      <w:r>
+        <w:t xml:space="preserve">processing </w:t>
+      </w:r>
+      <w:del w:id="375" w:author="MVT proposed additions" w:date="2026-10-29T16:39:26Z">
+        <w:r>
+          <w:delText xml:space="preserve">issue</w:delText>
+        </w:r>
+      </w:del>
+      <w:ins w:id="376" w:author="MVT proposed additions" w:date="2026-10-29T16:39:26Z">
+        <w:r>
+          <w:t xml:space="preserve">issues account for the movements</w:t>
+        </w:r>
+      </w:ins>
+      <w:r>
+        <w:t xml:space="preserve">.</w:t>
       </w:r>
     </w:p>
     <w:p>
@@ -2323,6 +2541,92 @@
       <w:r>
         <w:t>Confirm and document how ratios with near-zero positive denominators should be interpreted and treated in modelling and validation, including any limitations on use.</w:t>
       </w:r>
+    </w:p>
+    <w:p>
+      <w:pPr>
+        <w:pStyle w:val="Heading2"/>
+        <w:rPr>
+          <w:ins w:id="396" w:author="MVT proposed additions" w:date="2026-10-29T16:39:26Z"/>
+        </w:rPr>
+      </w:pPr>
+      <w:ins w:id="397" w:author="MVT proposed additions" w:date="2026-10-29T16:39:26Z">
+        <w:r>
+          <w:t xml:space="preserve">6. November 2019 credit and debit payment movements</w:t>
+        </w:r>
+      </w:ins>
+    </w:p>
+    <w:p>
+      <w:pPr>
+        <w:pStyle w:val="FirstParagraph"/>
+        <w:rPr>
+          <w:ins w:id="398" w:author="MVT proposed additions" w:date="2026-10-29T16:39:26Z"/>
+        </w:rPr>
+      </w:pPr>
+      <w:ins w:id="399" w:author="MVT proposed additions" w:date="2026-10-29T16:39:26Z">
+        <w:r>
+          <w:t xml:space="preserve">Observation: Mean PAYMENTS_DR_AMT increases from 98.36 in October 2019 to 9,392.58 in November, then falls to 80.69 in December. Mean PAYMENTS_CR_AMT changes from -1,437.24 to -10,718.66 and then -1,422.51 over the same months. Both standard deviations rise to approximately 3.04 million in November and fall sharply in December. Valid observation counts remain broadly stable.</w:t>
+        </w:r>
+      </w:ins>
+    </w:p>
+    <w:p>
+      <w:pPr>
+        <w:pStyle w:val="BodyText"/>
+        <w:rPr>
+          <w:ins w:id="400" w:author="MVT proposed additions" w:date="2026-10-29T16:39:26Z"/>
+        </w:rPr>
+      </w:pPr>
+      <w:ins w:id="401" w:author="MVT proposed additions" w:date="2026-10-29T16:39:26Z">
+        <w:r>
+          <w:t xml:space="preserve">The attestation comments for these fields (W58/W59) state “Reviewed, no material DQ issues found”, but do not explain this event. The aggregate results do not establish whether the movements reflect valid large transactions, reversals or a processing issue.</w:t>
+        </w:r>
+      </w:ins>
+    </w:p>
+    <w:p>
+      <w:pPr>
+        <w:pStyle w:val="BodyText"/>
+        <w:rPr>
+          <w:ins w:id="402" w:author="MVT proposed additions" w:date="2026-10-29T16:39:26Z"/>
+        </w:rPr>
+      </w:pPr>
+      <w:ins w:id="403" w:author="MVT proposed additions" w:date="2026-10-29T16:39:26Z">
+        <w:r>
+          <w:t xml:space="preserve">Requested action:</w:t>
+        </w:r>
+      </w:ins>
+    </w:p>
+    <w:p>
+      <w:pPr>
+        <w:pStyle w:val="Compact"/>
+        <w:numPr>
+          <w:ilvl w:val="0"/>
+          <w:numId w:val="6"/>
+        </w:numPr>
+        <w:rPr>
+          <w:ins w:id="404" w:author="MVT proposed additions" w:date="2026-10-29T16:39:26Z"/>
+        </w:rPr>
+      </w:pPr>
+      <w:ins w:id="405" w:author="MVT proposed additions" w:date="2026-10-29T16:39:26Z">
+        <w:r>
+          <w:t xml:space="preserve">Identify the records and transactions driving the November 2019 movements and confirm whether the amounts and their treatment are correct, including any large or offsetting credit/debit transactions.</w:t>
+        </w:r>
+      </w:ins>
+    </w:p>
+    <w:p>
+      <w:pPr>
+        <w:pStyle w:val="Compact"/>
+        <w:numPr>
+          <w:ilvl w:val="0"/>
+          <w:numId w:val="6"/>
+        </w:numPr>
+        <w:rPr>
+          <w:ins w:id="406" w:author="MVT proposed additions" w:date="2026-10-29T16:39:26Z"/>
+        </w:rPr>
+      </w:pPr>
+      <w:ins w:id="407" w:author="MVT proposed additions" w:date="2026-10-29T16:39:26Z">
+        <w:r>
+          <w:t xml:space="preserve">Confirm whether related derived fields or model inputs are affected. Make any necessary corrections and record the explanation, affected scope and any limitations on use in the attestation.</w:t>
+        </w:r>
+      </w:ins>
     </w:p>
     <w:p>
       <w:pPr>
@@ -3033,23 +3337,61 @@
             </w:pPr>
             <w:r>
               <w:rPr>
-                <w:sz w:val="18"/>
-              </w:rPr>
-              <w:t xml:space="preserve">Historical special values in </w:t>
-            </w:r>
-            <w:r>
-              <w:rPr>
                 <w:rStyle w:val="VerbatimChar"/>
                 <w:sz w:val="18"/>
               </w:rPr>
-              <w:t>CALC_CUST_ALL_CHNG_CR_TURNOVER</w:t>
-            </w:r>
-            <w:r>
-              <w:rPr>
-                <w:sz w:val="18"/>
-              </w:rPr>
-              <w:t xml:space="preserve"> before January 2007</w:t>
-            </w:r>
+              <w:t xml:space="preserve">Historical </w:t>
+            </w:r>
+            <w:ins w:id="377" w:author="MVT proposed additions" w:date="2026-10-29T16:39:26Z">
+              <w:r>
+                <w:rPr>
+                  <w:rStyle w:val="VerbatimChar"/>
+                  <w:sz w:val="18"/>
+                </w:rPr>
+                <w:t xml:space="preserve">availability and missing/</w:t>
+              </w:r>
+            </w:ins>
+            <w:r>
+              <w:rPr>
+                <w:rStyle w:val="VerbatimChar"/>
+                <w:sz w:val="18"/>
+              </w:rPr>
+              <w:t xml:space="preserve">special </w:t>
+            </w:r>
+            <w:del w:id="378" w:author="MVT proposed additions" w:date="2026-10-29T16:39:26Z">
+              <w:r>
+                <w:rPr>
+                  <w:rStyle w:val="VerbatimChar"/>
+                  <w:sz w:val="18"/>
+                </w:rPr>
+                <w:delText xml:space="preserve">values</w:delText>
+              </w:r>
+            </w:del>
+            <w:ins w:id="379" w:author="MVT proposed additions" w:date="2026-10-29T16:39:26Z">
+              <w:r>
+                <w:rPr>
+                  <w:rStyle w:val="VerbatimChar"/>
+                  <w:sz w:val="18"/>
+                </w:rPr>
+                <w:t xml:space="preserve">coding</w:t>
+              </w:r>
+            </w:ins>
+            <w:r>
+              <w:rPr>
+                <w:rStyle w:val="VerbatimChar"/>
+                <w:sz w:val="18"/>
+              </w:rPr>
+              <w:t xml:space="preserve"> in CALC_CUST_ALL_CHNG_CR_TURNOVER</w:t>
+            </w:r>
+            <w:del w:id="380" w:author="MVT proposed additions" w:date="2026-10-29T16:39:26Z">
+              <w:r>
+                <w:rPr>
+                  <w:rStyle w:val="VerbatimChar"/>
+                  <w:sz w:val="18"/>
+                </w:rPr>
+                <w:delText xml:space="preserve"> before January 2007</w:delText>
+              </w:r>
+            </w:del>
           </w:p>
         </w:tc>
         <w:tc>
@@ -3069,12 +3411,138 @@
               <w:pStyle w:val="Compact"/>
               <w:spacing w:after="0"/>
             </w:pPr>
-            <w:r>
-              <w:rPr>
-                <w:sz w:val="18"/>
-              </w:rPr>
-              <w:t>Data available from January 2007; earlier 100% special values documented (V564/W564).</w:t>
-            </w:r>
+            <w:del w:id="381" w:author="MVT proposed additions" w:date="2026-10-29T16:39:26Z">
+              <w:r>
+                <w:rPr>
+                  <w:sz w:val="18"/>
+                </w:rPr>
+                <w:delText xml:space="preserve">Data</w:delText>
+              </w:r>
+            </w:del>
+            <w:ins w:id="382" w:author="MVT proposed additions" w:date="2026-10-29T16:39:26Z">
+              <w:r>
+                <w:rPr>
+                  <w:sz w:val="18"/>
+                </w:rPr>
+                <w:t xml:space="preserve">V564</w:t>
+              </w:r>
+            </w:ins>
+            <w:r>
+              <w:rPr>
+                <w:sz w:val="18"/>
+              </w:rPr>
+              <w:t xml:space="preserve"> </w:t>
+            </w:r>
+            <w:del w:id="383" w:author="MVT proposed additions" w:date="2026-10-29T16:39:26Z">
+              <w:r>
+                <w:rPr>
+                  <w:sz w:val="18"/>
+                </w:rPr>
+                <w:delText xml:space="preserve">available</w:delText>
+              </w:r>
+            </w:del>
+            <w:ins w:id="384" w:author="MVT proposed additions" w:date="2026-10-29T16:39:26Z">
+              <w:r>
+                <w:rPr>
+                  <w:sz w:val="18"/>
+                </w:rPr>
+                <w:t xml:space="preserve">records availability</w:t>
+              </w:r>
+            </w:ins>
+            <w:r>
+              <w:rPr>
+                <w:sz w:val="18"/>
+              </w:rPr>
+              <w:t xml:space="preserve"> from January 2007</w:t>
+            </w:r>
+            <w:del w:id="385" w:author="MVT proposed additions" w:date="2026-10-29T16:39:26Z">
+              <w:r>
+                <w:rPr>
+                  <w:sz w:val="18"/>
+                </w:rPr>
+                <w:delText xml:space="preserve">;</w:delText>
+              </w:r>
+            </w:del>
+            <w:ins w:id="386" w:author="MVT proposed additions" w:date="2026-10-29T16:39:26Z">
+              <w:r>
+                <w:rPr>
+                  <w:sz w:val="18"/>
+                </w:rPr>
+                <w:t xml:space="preserve">, and O564 sets</w:t>
+              </w:r>
+            </w:ins>
+            <w:r>
+              <w:rPr>
+                <w:sz w:val="18"/>
+              </w:rPr>
+              <w:t xml:space="preserve"> earlier</w:t>
+            </w:r>
+            <w:ins w:id="387" w:author="MVT proposed additions" w:date="2026-10-29T16:39:26Z">
+              <w:r>
+                <w:rPr>
+                  <w:sz w:val="18"/>
+                </w:rPr>
+                <w:t xml:space="preserve"> values to NULL. W564 instead describes</w:t>
+              </w:r>
+            </w:ins>
+            <w:r>
+              <w:rPr>
+                <w:sz w:val="18"/>
+              </w:rPr>
+              <w:t xml:space="preserve"> 100% special values </w:t>
+            </w:r>
+            <w:del w:id="388" w:author="MVT proposed additions" w:date="2026-10-29T16:39:26Z">
+              <w:r>
+                <w:rPr>
+                  <w:sz w:val="18"/>
+                </w:rPr>
+                <w:delText xml:space="preserve">documented</w:delText>
+              </w:r>
+            </w:del>
+            <w:ins w:id="389" w:author="MVT proposed additions" w:date="2026-10-29T16:39:26Z">
+              <w:r>
+                <w:rPr>
+                  <w:sz w:val="18"/>
+                </w:rPr>
+                <w:t xml:space="preserve">before</w:t>
+              </w:r>
+            </w:ins>
+            <w:r>
+              <w:rPr>
+                <w:sz w:val="18"/>
+              </w:rPr>
+              <w:t xml:space="preserve"> </w:t>
+            </w:r>
+            <w:del w:id="390" w:author="MVT proposed additions" w:date="2026-10-29T16:39:26Z">
+              <w:r>
+                <w:rPr>
+                  <w:sz w:val="18"/>
+                </w:rPr>
+                <w:delText xml:space="preserve">(V564/W564)</w:delText>
+              </w:r>
+            </w:del>
+            <w:ins w:id="391" w:author="MVT proposed additions" w:date="2026-10-29T16:39:26Z">
+              <w:r>
+                <w:rPr>
+                  <w:sz w:val="18"/>
+                </w:rPr>
+                <w:t xml:space="preserve">January 2007</w:t>
+              </w:r>
+            </w:ins>
+            <w:r>
+              <w:rPr>
+                <w:sz w:val="18"/>
+              </w:rPr>
+              <w:t xml:space="preserve">.</w:t>
+            </w:r>
+            <w:ins w:id="392" w:author="MVT proposed additions" w:date="2026-10-29T16:39:26Z">
+              <w:r>
+                <w:rPr>
+                  <w:sz w:val="18"/>
+                </w:rPr>
+                <w:t xml:space="preserve"> The MoM results show 100% missing in December 2006, changing to 100% special in January 2007.</w:t>
+              </w:r>
+            </w:ins>
           </w:p>
         </w:tc>
         <w:tc>
@@ -3132,6 +3600,11 @@
               </w:rPr>
               <w:t xml:space="preserve">.</w:t>
             </w:r>
+            <w:ins w:id="393" w:author="MVT proposed additions" w:date="2026-10-29T16:39:26Z">
+              <w:r>
+                <w:t xml:space="preserve"> The missing-versus-special description is inconsistent and should be clarified in the attestation.</w:t>
+              </w:r>
+            </w:ins>
           </w:p>
         </w:tc>
       </w:tr>

</xml_diff>